<commit_message>
Migração para projeto Maven (compatibilidade com NetBeans + Maven)
- Substitui a estrutura Ant/NetBeans (nbproject, build.xml) por pom.xml
- Codigo fonte movido de src/com/... para src/main/java/com/... (padrao Maven)
- Projeto de testes separado (controle-financeiro-core-test) foi eliminado;
  os testes JUnit 5 agora ficam em src/test/java/com/..., dentro do mesmo
  projeto Maven, que e a estrutura padrao e reconhecida automaticamente
  pelo NetBeans (nos 'Source Packages' e 'Test Packages')
- JUnit 5 declarado como dependencia de teste no pom.xml (baixado
  automaticamente pelo Maven, sem configuracao manual de biblioteca)
- README.md, INSTRUCOES_GIT.md e plano de testes atualizados para Maven
</commit_message>
<xml_diff>
--- a/docs/PLANO_DE_TESTES_ETAPA7.docx
+++ b/docs/PLANO_DE_TESTES_ETAPA7.docx
@@ -4170,7 +4170,7 @@
         <w:spacing w:after="150"/>
       </w:pPr>
       <w:r>
-        <w:t xml:space="preserve">1. Abra os projetos controle-financeiro-core e controle-financeiro-core-test no NetBeans (ver SETUP_TESTES.md).</w:t>
+        <w:t xml:space="preserve">O projeto controle-financeiro-core é um projeto Maven. Os testes JUnit 5 ficam em src/test/java, junto ao código-fonte principal (src/main/java), seguindo a estrutura padrão do Maven.</w:t>
       </w:r>
     </w:p>
     <w:p>
@@ -4178,7 +4178,7 @@
         <w:spacing w:after="150"/>
       </w:pPr>
       <w:r>
-        <w:t xml:space="preserve">2. Clique com o botão direito em controle-financeiro-core → Clean and Build.</w:t>
+        <w:t xml:space="preserve">1. Abra a pasta controle-financeiro-core (a que contém o pom.xml) no NetBeans: File → Open Project.</w:t>
       </w:r>
     </w:p>
     <w:p>
@@ -4186,7 +4186,15 @@
         <w:spacing w:after="150"/>
       </w:pPr>
       <w:r>
-        <w:t xml:space="preserve">3. Clique com o botão direito em controle-financeiro-core-test → Test (Alt+F6).</w:t>
+        <w:t xml:space="preserve">2. Clique com o botão direito no projeto → Clean and Build (o Maven baixa o JUnit 5 automaticamente na primeira vez, é necessário estar conectado à internet).</w:t>
+      </w:r>
+    </w:p>
+    <w:p>
+      <w:pPr>
+        <w:spacing w:after="150"/>
+      </w:pPr>
+      <w:r>
+        <w:t xml:space="preserve">3. Clique com o botão direito no projeto → Test (Alt+F6). Alternativamente, rode "mvn test" no terminal, dentro da pasta do projeto.</w:t>
       </w:r>
     </w:p>
     <w:p>

</xml_diff>